<commit_message>
added code in lab_3
</commit_message>
<xml_diff>
--- a/lab_2.docx
+++ b/lab_2.docx
@@ -1082,10 +1082,60 @@
         <w:jc w:val="center"/>
         <w:rPr>
           <w:rFonts w:hint="default" w:ascii="Times New Roman" w:hAnsi="Times New Roman" w:cs="Times New Roman"/>
-          <w:sz w:val="28"/>
-          <w:szCs w:val="28"/>
-        </w:rPr>
-      </w:pPr>
+          <w:color w:val="000000"/>
+          <w:sz w:val="28"/>
+          <w:szCs w:val="28"/>
+        </w:rPr>
+      </w:pPr>
+    </w:p>
+    <w:p>
+      <w:pPr>
+        <w:pStyle w:val="9"/>
+        <w:keepNext w:val="0"/>
+        <w:keepLines w:val="0"/>
+        <w:widowControl/>
+        <w:suppressLineNumbers w:val="0"/>
+        <w:pBdr>
+          <w:top w:val="none" w:color="auto" w:sz="0" w:space="0"/>
+          <w:left w:val="none" w:color="auto" w:sz="0" w:space="0"/>
+          <w:bottom w:val="none" w:color="auto" w:sz="0" w:space="0"/>
+          <w:right w:val="none" w:color="auto" w:sz="0" w:space="0"/>
+          <w:between w:val="none" w:color="auto" w:sz="0" w:space="0"/>
+        </w:pBdr>
+        <w:spacing w:before="0" w:beforeAutospacing="0" w:after="0" w:afterAutospacing="0" w:line="360" w:lineRule="auto"/>
+        <w:jc w:val="center"/>
+        <w:rPr>
+          <w:rFonts w:hint="default" w:ascii="Times New Roman" w:hAnsi="Times New Roman" w:cs="Times New Roman"/>
+          <w:color w:val="000000"/>
+          <w:sz w:val="28"/>
+          <w:szCs w:val="28"/>
+        </w:rPr>
+      </w:pPr>
+    </w:p>
+    <w:p>
+      <w:pPr>
+        <w:pStyle w:val="9"/>
+        <w:keepNext w:val="0"/>
+        <w:keepLines w:val="0"/>
+        <w:widowControl/>
+        <w:suppressLineNumbers w:val="0"/>
+        <w:pBdr>
+          <w:top w:val="none" w:color="auto" w:sz="0" w:space="0"/>
+          <w:left w:val="none" w:color="auto" w:sz="0" w:space="0"/>
+          <w:bottom w:val="none" w:color="auto" w:sz="0" w:space="0"/>
+          <w:right w:val="none" w:color="auto" w:sz="0" w:space="0"/>
+          <w:between w:val="none" w:color="auto" w:sz="0" w:space="0"/>
+        </w:pBdr>
+        <w:spacing w:before="0" w:beforeAutospacing="0" w:after="0" w:afterAutospacing="0" w:line="360" w:lineRule="auto"/>
+        <w:jc w:val="center"/>
+        <w:rPr>
+          <w:rFonts w:hint="default" w:ascii="Times New Roman" w:hAnsi="Times New Roman" w:cs="Times New Roman"/>
+          <w:sz w:val="28"/>
+          <w:szCs w:val="28"/>
+        </w:rPr>
+      </w:pPr>
+      <w:bookmarkStart w:id="0" w:name="_GoBack"/>
+      <w:bookmarkEnd w:id="0"/>
       <w:r>
         <w:rPr>
           <w:rFonts w:hint="default" w:ascii="Times New Roman" w:hAnsi="Times New Roman" w:cs="Times New Roman"/>
@@ -8647,8 +8697,6 @@
         </w:rPr>
         <w:t>().</w:t>
       </w:r>
-      <w:bookmarkStart w:id="0" w:name="_GoBack"/>
-      <w:bookmarkEnd w:id="0"/>
     </w:p>
     <w:sectPr>
       <w:pgSz w:w="11906" w:h="16838"/>

</xml_diff>